<commit_message>
CV: lead with Product Designer (UX/UI)
The CV page, the print source, the ATS Word generator and the regenerated English PDF and DOCX now match the rest of the site: title "Product Designer (UX/UI)", a design-first summary, design competencies listed first, and the founder role as Founder & Product Designer. Job history at Africa Israel and Hamashbir is unchanged. The Hebrew CV already used a designer title.

Co-Authored-By: Claude Opus 5.5 (1M context) <noreply@anthropic.com>
Claude-Session: https://claude.ai/code/session_011xhEtxfqyMDKwV116HvjcT
</commit_message>
<xml_diff>
--- a/Oron_Turgeman_Resume.docx
+++ b/Oron_Turgeman_Resume.docx
@@ -32,7 +32,7 @@
           <w:sz w:val="22"/>
           <w:szCs w:val="22"/>
         </w:rPr>
-        <w:t xml:space="preserve">Product Manager  |  Project Manager  |  Product Designer</w:t>
+        <w:t xml:space="preserve">Product Designer (UX/UI)</w:t>
       </w:r>
     </w:p>
     <w:p>
@@ -48,7 +48,7 @@
         </w:rPr>
         <w:t xml:space="preserve">Hadera, Israel  ·  052-4541258  ·  </w:t>
       </w:r>
-      <w:hyperlink w:history="1" r:id="rId2abe6w139tqntnl642kyy">
+      <w:hyperlink w:history="1" r:id="rIdmp1n0ukaogtjnpj_v20t-">
         <w:r>
           <w:rPr>
             <w:rFonts w:ascii="Calibri" w:cs="Calibri" w:eastAsia="Calibri" w:hAnsi="Calibri"/>
@@ -68,7 +68,7 @@
         </w:rPr>
         <w:t xml:space="preserve">  ·  </w:t>
       </w:r>
-      <w:hyperlink w:history="1" r:id="rIdbcyutqvgte6ri1e883thw">
+      <w:hyperlink w:history="1" r:id="rIdhmxrpvsum2al3836t6v-s">
         <w:r>
           <w:rPr>
             <w:rFonts w:ascii="Calibri" w:cs="Calibri" w:eastAsia="Calibri" w:hAnsi="Calibri"/>
@@ -88,7 +88,7 @@
         </w:rPr>
         <w:t xml:space="preserve">  ·  </w:t>
       </w:r>
-      <w:hyperlink w:history="1" r:id="rIdvhlgw3rc3ajzknk3xx-wr">
+      <w:hyperlink w:history="1" r:id="rIdisskn5bv8wgf3g3njxdzf">
         <w:r>
           <w:rPr>
             <w:rFonts w:ascii="Calibri" w:cs="Calibri" w:eastAsia="Calibri" w:hAnsi="Calibri"/>
@@ -133,16 +133,56 @@
           <w:sz w:val="20"/>
           <w:szCs w:val="20"/>
         </w:rPr>
-        <w:t xml:space="preserve">Product Manager and Project Manager</w:t>
-      </w:r>
-      <w:r>
-        <w:rPr>
-          <w:rFonts w:ascii="Calibri" w:cs="Calibri" w:eastAsia="Calibri" w:hAnsi="Calibri"/>
-          <w:color w:val="1A1A1A"/>
-          <w:sz w:val="20"/>
-          <w:szCs w:val="20"/>
-        </w:rPr>
-        <w:t xml:space="preserve"> with 6+ years leading </w:t>
+        <w:t xml:space="preserve">Product Designer (UX/UI)</w:t>
+      </w:r>
+      <w:r>
+        <w:rPr>
+          <w:rFonts w:ascii="Calibri" w:cs="Calibri" w:eastAsia="Calibri" w:hAnsi="Calibri"/>
+          <w:color w:val="1A1A1A"/>
+          <w:sz w:val="20"/>
+          <w:szCs w:val="20"/>
+        </w:rPr>
+        <w:t xml:space="preserve"> who ships real products, designing end-to-end from </w:t>
+      </w:r>
+      <w:r>
+        <w:rPr>
+          <w:rFonts w:ascii="Calibri" w:cs="Calibri" w:eastAsia="Calibri" w:hAnsi="Calibri"/>
+          <w:b/>
+          <w:bCs/>
+          <w:color w:val="1A1A1A"/>
+          <w:sz w:val="20"/>
+          <w:szCs w:val="20"/>
+        </w:rPr>
+        <w:t xml:space="preserve">user research and product characterization (PRD)</w:t>
+      </w:r>
+      <w:r>
+        <w:rPr>
+          <w:rFonts w:ascii="Calibri" w:cs="Calibri" w:eastAsia="Calibri" w:hAnsi="Calibri"/>
+          <w:color w:val="1A1A1A"/>
+          <w:sz w:val="20"/>
+          <w:szCs w:val="20"/>
+        </w:rPr>
+        <w:t xml:space="preserve"> through </w:t>
+      </w:r>
+      <w:r>
+        <w:rPr>
+          <w:rFonts w:ascii="Calibri" w:cs="Calibri" w:eastAsia="Calibri" w:hAnsi="Calibri"/>
+          <w:b/>
+          <w:bCs/>
+          <w:color w:val="1A1A1A"/>
+          <w:sz w:val="20"/>
+          <w:szCs w:val="20"/>
+        </w:rPr>
+        <w:t xml:space="preserve">flows, prototypes, high-fidelity UI and design systems</w:t>
+      </w:r>
+      <w:r>
+        <w:rPr>
+          <w:rFonts w:ascii="Calibri" w:cs="Calibri" w:eastAsia="Calibri" w:hAnsi="Calibri"/>
+          <w:color w:val="1A1A1A"/>
+          <w:sz w:val="20"/>
+          <w:szCs w:val="20"/>
+        </w:rPr>
+        <w:t xml:space="preserve"> to launch and iteration. 6+ years leading </w:t>
       </w:r>
       <w:r>
         <w:rPr>
@@ -162,27 +202,27 @@
           <w:sz w:val="20"/>
           <w:szCs w:val="20"/>
         </w:rPr>
-        <w:t xml:space="preserve"> in advertising and digital, now building and shipping digital products end-to-end. Advertising project leadership is the same discipline as tech product management — </w:t>
-      </w:r>
-      <w:r>
-        <w:rPr>
-          <w:rFonts w:ascii="Calibri" w:cs="Calibri" w:eastAsia="Calibri" w:hAnsi="Calibri"/>
-          <w:b/>
-          <w:bCs/>
-          <w:color w:val="1A1A1A"/>
-          <w:sz w:val="20"/>
-          <w:szCs w:val="20"/>
-        </w:rPr>
-        <w:t xml:space="preserve">briefs, requirements, stakeholders, budgets, deadlines and measurable results</w:t>
-      </w:r>
-      <w:r>
-        <w:rPr>
-          <w:rFonts w:ascii="Calibri" w:cs="Calibri" w:eastAsia="Calibri" w:hAnsi="Calibri"/>
-          <w:color w:val="1A1A1A"/>
-          <w:sz w:val="20"/>
-          <w:szCs w:val="20"/>
-        </w:rPr>
-        <w:t xml:space="preserve"> — applied to products instead of campaigns.</w:t>
+        <w:t xml:space="preserve"> in advertising and digital keep the design tied to </w:t>
+      </w:r>
+      <w:r>
+        <w:rPr>
+          <w:rFonts w:ascii="Calibri" w:cs="Calibri" w:eastAsia="Calibri" w:hAnsi="Calibri"/>
+          <w:b/>
+          <w:bCs/>
+          <w:color w:val="1A1A1A"/>
+          <w:sz w:val="20"/>
+          <w:szCs w:val="20"/>
+        </w:rPr>
+        <w:t xml:space="preserve">stakeholders, budgets, deadlines and measurable results</w:t>
+      </w:r>
+      <w:r>
+        <w:rPr>
+          <w:rFonts w:ascii="Calibri" w:cs="Calibri" w:eastAsia="Calibri" w:hAnsi="Calibri"/>
+          <w:color w:val="1A1A1A"/>
+          <w:sz w:val="20"/>
+          <w:szCs w:val="20"/>
+        </w:rPr>
+        <w:t xml:space="preserve">.</w:t>
       </w:r>
     </w:p>
     <w:p>
@@ -227,18 +267,18 @@
           <w:sz w:val="20"/>
           <w:szCs w:val="20"/>
         </w:rPr>
-        <w:t xml:space="preserve">, 486 registered users and a 5.0-star App Store rating — owned solo from </w:t>
-      </w:r>
-      <w:r>
-        <w:rPr>
-          <w:rFonts w:ascii="Calibri" w:cs="Calibri" w:eastAsia="Calibri" w:hAnsi="Calibri"/>
-          <w:b/>
-          <w:bCs/>
-          <w:color w:val="1A1A1A"/>
-          <w:sz w:val="20"/>
-          <w:szCs w:val="20"/>
-        </w:rPr>
-        <w:t xml:space="preserve">market research and product characterization (PRD)</w:t>
+        <w:t xml:space="preserve">, 486 registered users and a 5.0-star App Store rating — designed and owned solo from </w:t>
+      </w:r>
+      <w:r>
+        <w:rPr>
+          <w:rFonts w:ascii="Calibri" w:cs="Calibri" w:eastAsia="Calibri" w:hAnsi="Calibri"/>
+          <w:b/>
+          <w:bCs/>
+          <w:color w:val="1A1A1A"/>
+          <w:sz w:val="20"/>
+          <w:szCs w:val="20"/>
+        </w:rPr>
+        <w:t xml:space="preserve">market research</w:t>
       </w:r>
       <w:r>
         <w:rPr>
@@ -303,6 +343,56 @@
           <w:sz w:val="20"/>
           <w:szCs w:val="20"/>
         </w:rPr>
+        <w:t xml:space="preserve">UX / Product Design: </w:t>
+      </w:r>
+      <w:r>
+        <w:rPr>
+          <w:rFonts w:ascii="Calibri" w:cs="Calibri" w:eastAsia="Calibri" w:hAnsi="Calibri"/>
+          <w:color w:val="1A1A1A"/>
+          <w:sz w:val="20"/>
+          <w:szCs w:val="20"/>
+        </w:rPr>
+        <w:t xml:space="preserve">User Flows · Information Architecture · Wireframing · Prototyping · High-Fidelity UI · Design Systems · Usability Testing · Accessibility · Mobile (iOS) &amp; Web</w:t>
+      </w:r>
+    </w:p>
+    <w:p>
+      <w:pPr>
+        <w:spacing w:after="60"/>
+      </w:pPr>
+      <w:r>
+        <w:rPr>
+          <w:rFonts w:ascii="Calibri" w:cs="Calibri" w:eastAsia="Calibri" w:hAnsi="Calibri"/>
+          <w:b/>
+          <w:bCs/>
+          <w:color w:val="1A1A1A"/>
+          <w:sz w:val="20"/>
+          <w:szCs w:val="20"/>
+        </w:rPr>
+        <w:t xml:space="preserve">Research &amp; Strategy: </w:t>
+      </w:r>
+      <w:r>
+        <w:rPr>
+          <w:rFonts w:ascii="Calibri" w:cs="Calibri" w:eastAsia="Calibri" w:hAnsi="Calibri"/>
+          <w:color w:val="1A1A1A"/>
+          <w:sz w:val="20"/>
+          <w:szCs w:val="20"/>
+        </w:rPr>
+        <w:t xml:space="preserve">Market Research · Competitive Analysis · Pricing Strategy · User Research &amp; Interviews · Personas &amp; User Journeys · Business Requirements Analysis · Go-to-Market Strategy</w:t>
+      </w:r>
+    </w:p>
+    <w:p>
+      <w:pPr>
+        <w:spacing w:after="60"/>
+      </w:pPr>
+      <w:r>
+        <w:rPr>
+          <w:rFonts w:ascii="Calibri" w:cs="Calibri" w:eastAsia="Calibri" w:hAnsi="Calibri"/>
+          <w:b/>
+          <w:bCs/>
+          <w:color w:val="1A1A1A"/>
+          <w:sz w:val="20"/>
+          <w:szCs w:val="20"/>
+        </w:rPr>
         <w:t xml:space="preserve">Product Management: </w:t>
       </w:r>
       <w:r>
@@ -338,56 +428,6 @@
           <w:szCs w:val="20"/>
         </w:rPr>
         <w:t xml:space="preserve">End-to-End Delivery · Cross-Functional Leadership · Stakeholder Management · Scope &amp; Timeline Management · Budget Management · Vendor Management · Risk &amp; Dependency Tracking · Agile Ways of Working</w:t>
-      </w:r>
-    </w:p>
-    <w:p>
-      <w:pPr>
-        <w:spacing w:after="60"/>
-      </w:pPr>
-      <w:r>
-        <w:rPr>
-          <w:rFonts w:ascii="Calibri" w:cs="Calibri" w:eastAsia="Calibri" w:hAnsi="Calibri"/>
-          <w:b/>
-          <w:bCs/>
-          <w:color w:val="1A1A1A"/>
-          <w:sz w:val="20"/>
-          <w:szCs w:val="20"/>
-        </w:rPr>
-        <w:t xml:space="preserve">Research &amp; Strategy: </w:t>
-      </w:r>
-      <w:r>
-        <w:rPr>
-          <w:rFonts w:ascii="Calibri" w:cs="Calibri" w:eastAsia="Calibri" w:hAnsi="Calibri"/>
-          <w:color w:val="1A1A1A"/>
-          <w:sz w:val="20"/>
-          <w:szCs w:val="20"/>
-        </w:rPr>
-        <w:t xml:space="preserve">Market Research · Competitive Analysis · Pricing Strategy · User Research &amp; Interviews · Personas &amp; User Journeys · Business Requirements Analysis · Go-to-Market Strategy</w:t>
-      </w:r>
-    </w:p>
-    <w:p>
-      <w:pPr>
-        <w:spacing w:after="60"/>
-      </w:pPr>
-      <w:r>
-        <w:rPr>
-          <w:rFonts w:ascii="Calibri" w:cs="Calibri" w:eastAsia="Calibri" w:hAnsi="Calibri"/>
-          <w:b/>
-          <w:bCs/>
-          <w:color w:val="1A1A1A"/>
-          <w:sz w:val="20"/>
-          <w:szCs w:val="20"/>
-        </w:rPr>
-        <w:t xml:space="preserve">UX / Product Design: </w:t>
-      </w:r>
-      <w:r>
-        <w:rPr>
-          <w:rFonts w:ascii="Calibri" w:cs="Calibri" w:eastAsia="Calibri" w:hAnsi="Calibri"/>
-          <w:color w:val="1A1A1A"/>
-          <w:sz w:val="20"/>
-          <w:szCs w:val="20"/>
-        </w:rPr>
-        <w:t xml:space="preserve">User Flows · Information Architecture · Wireframing · Prototyping · High-Fidelity UI · Design Systems · Usability Testing · Accessibility · Mobile (iOS) &amp; Web</w:t>
       </w:r>
     </w:p>
     <w:p>
@@ -423,7 +463,7 @@
           <w:sz w:val="22"/>
           <w:szCs w:val="22"/>
         </w:rPr>
-        <w:t xml:space="preserve">Founder &amp; Product Manager — Independent Digital Products</w:t>
+        <w:t xml:space="preserve">Founder &amp; Product Designer — Independent Digital Products</w:t>
       </w:r>
     </w:p>
     <w:p>
@@ -1373,7 +1413,7 @@
         </w:rPr>
         <w:t xml:space="preserve">Full case studies, process and screens: </w:t>
       </w:r>
-      <w:hyperlink w:history="1" r:id="rId6xcyfgiqwg_kzmfjzcyhx">
+      <w:hyperlink w:history="1" r:id="rIdoinvzdjnicmhtutsu8j_z">
         <w:r>
           <w:rPr>
             <w:rFonts w:ascii="Calibri" w:cs="Calibri" w:eastAsia="Calibri" w:hAnsi="Calibri"/>

</xml_diff>

<commit_message>
Portfolio redesign: studio-grey home, work, about, case studies and CV (#63)
Studio-grey redesign of the portfolio for hi-tech recruiters: new home (hero film, typographic name, expanding project panels, pinned Design Thinking section, Figma-style AI notes), rebuilt Work and About pages, case studies restyled with Design Thinking chapters, a responsive pass, and a CV that leads with Product Designer (UX/UI) with regenerated PDF and DOCX.

Co-Authored-By: Claude Opus 5.5 (1M context) <noreply@anthropic.com>
Claude-Session: https://claude.ai/code/session_011xhEtxfqyMDKwV116HvjcT
</commit_message>
<xml_diff>
--- a/Oron_Turgeman_Resume.docx
+++ b/Oron_Turgeman_Resume.docx
@@ -32,7 +32,7 @@
           <w:sz w:val="22"/>
           <w:szCs w:val="22"/>
         </w:rPr>
-        <w:t xml:space="preserve">Product Manager  |  Project Manager  |  Product Designer</w:t>
+        <w:t xml:space="preserve">Product Designer (UX/UI)</w:t>
       </w:r>
     </w:p>
     <w:p>
@@ -48,7 +48,7 @@
         </w:rPr>
         <w:t xml:space="preserve">Hadera, Israel  ·  052-4541258  ·  </w:t>
       </w:r>
-      <w:hyperlink w:history="1" r:id="rId2abe6w139tqntnl642kyy">
+      <w:hyperlink w:history="1" r:id="rIdmp1n0ukaogtjnpj_v20t-">
         <w:r>
           <w:rPr>
             <w:rFonts w:ascii="Calibri" w:cs="Calibri" w:eastAsia="Calibri" w:hAnsi="Calibri"/>
@@ -68,7 +68,7 @@
         </w:rPr>
         <w:t xml:space="preserve">  ·  </w:t>
       </w:r>
-      <w:hyperlink w:history="1" r:id="rIdbcyutqvgte6ri1e883thw">
+      <w:hyperlink w:history="1" r:id="rIdhmxrpvsum2al3836t6v-s">
         <w:r>
           <w:rPr>
             <w:rFonts w:ascii="Calibri" w:cs="Calibri" w:eastAsia="Calibri" w:hAnsi="Calibri"/>
@@ -88,7 +88,7 @@
         </w:rPr>
         <w:t xml:space="preserve">  ·  </w:t>
       </w:r>
-      <w:hyperlink w:history="1" r:id="rIdvhlgw3rc3ajzknk3xx-wr">
+      <w:hyperlink w:history="1" r:id="rIdisskn5bv8wgf3g3njxdzf">
         <w:r>
           <w:rPr>
             <w:rFonts w:ascii="Calibri" w:cs="Calibri" w:eastAsia="Calibri" w:hAnsi="Calibri"/>
@@ -133,16 +133,56 @@
           <w:sz w:val="20"/>
           <w:szCs w:val="20"/>
         </w:rPr>
-        <w:t xml:space="preserve">Product Manager and Project Manager</w:t>
-      </w:r>
-      <w:r>
-        <w:rPr>
-          <w:rFonts w:ascii="Calibri" w:cs="Calibri" w:eastAsia="Calibri" w:hAnsi="Calibri"/>
-          <w:color w:val="1A1A1A"/>
-          <w:sz w:val="20"/>
-          <w:szCs w:val="20"/>
-        </w:rPr>
-        <w:t xml:space="preserve"> with 6+ years leading </w:t>
+        <w:t xml:space="preserve">Product Designer (UX/UI)</w:t>
+      </w:r>
+      <w:r>
+        <w:rPr>
+          <w:rFonts w:ascii="Calibri" w:cs="Calibri" w:eastAsia="Calibri" w:hAnsi="Calibri"/>
+          <w:color w:val="1A1A1A"/>
+          <w:sz w:val="20"/>
+          <w:szCs w:val="20"/>
+        </w:rPr>
+        <w:t xml:space="preserve"> who ships real products, designing end-to-end from </w:t>
+      </w:r>
+      <w:r>
+        <w:rPr>
+          <w:rFonts w:ascii="Calibri" w:cs="Calibri" w:eastAsia="Calibri" w:hAnsi="Calibri"/>
+          <w:b/>
+          <w:bCs/>
+          <w:color w:val="1A1A1A"/>
+          <w:sz w:val="20"/>
+          <w:szCs w:val="20"/>
+        </w:rPr>
+        <w:t xml:space="preserve">user research and product characterization (PRD)</w:t>
+      </w:r>
+      <w:r>
+        <w:rPr>
+          <w:rFonts w:ascii="Calibri" w:cs="Calibri" w:eastAsia="Calibri" w:hAnsi="Calibri"/>
+          <w:color w:val="1A1A1A"/>
+          <w:sz w:val="20"/>
+          <w:szCs w:val="20"/>
+        </w:rPr>
+        <w:t xml:space="preserve"> through </w:t>
+      </w:r>
+      <w:r>
+        <w:rPr>
+          <w:rFonts w:ascii="Calibri" w:cs="Calibri" w:eastAsia="Calibri" w:hAnsi="Calibri"/>
+          <w:b/>
+          <w:bCs/>
+          <w:color w:val="1A1A1A"/>
+          <w:sz w:val="20"/>
+          <w:szCs w:val="20"/>
+        </w:rPr>
+        <w:t xml:space="preserve">flows, prototypes, high-fidelity UI and design systems</w:t>
+      </w:r>
+      <w:r>
+        <w:rPr>
+          <w:rFonts w:ascii="Calibri" w:cs="Calibri" w:eastAsia="Calibri" w:hAnsi="Calibri"/>
+          <w:color w:val="1A1A1A"/>
+          <w:sz w:val="20"/>
+          <w:szCs w:val="20"/>
+        </w:rPr>
+        <w:t xml:space="preserve"> to launch and iteration. 6+ years leading </w:t>
       </w:r>
       <w:r>
         <w:rPr>
@@ -162,27 +202,27 @@
           <w:sz w:val="20"/>
           <w:szCs w:val="20"/>
         </w:rPr>
-        <w:t xml:space="preserve"> in advertising and digital, now building and shipping digital products end-to-end. Advertising project leadership is the same discipline as tech product management — </w:t>
-      </w:r>
-      <w:r>
-        <w:rPr>
-          <w:rFonts w:ascii="Calibri" w:cs="Calibri" w:eastAsia="Calibri" w:hAnsi="Calibri"/>
-          <w:b/>
-          <w:bCs/>
-          <w:color w:val="1A1A1A"/>
-          <w:sz w:val="20"/>
-          <w:szCs w:val="20"/>
-        </w:rPr>
-        <w:t xml:space="preserve">briefs, requirements, stakeholders, budgets, deadlines and measurable results</w:t>
-      </w:r>
-      <w:r>
-        <w:rPr>
-          <w:rFonts w:ascii="Calibri" w:cs="Calibri" w:eastAsia="Calibri" w:hAnsi="Calibri"/>
-          <w:color w:val="1A1A1A"/>
-          <w:sz w:val="20"/>
-          <w:szCs w:val="20"/>
-        </w:rPr>
-        <w:t xml:space="preserve"> — applied to products instead of campaigns.</w:t>
+        <w:t xml:space="preserve"> in advertising and digital keep the design tied to </w:t>
+      </w:r>
+      <w:r>
+        <w:rPr>
+          <w:rFonts w:ascii="Calibri" w:cs="Calibri" w:eastAsia="Calibri" w:hAnsi="Calibri"/>
+          <w:b/>
+          <w:bCs/>
+          <w:color w:val="1A1A1A"/>
+          <w:sz w:val="20"/>
+          <w:szCs w:val="20"/>
+        </w:rPr>
+        <w:t xml:space="preserve">stakeholders, budgets, deadlines and measurable results</w:t>
+      </w:r>
+      <w:r>
+        <w:rPr>
+          <w:rFonts w:ascii="Calibri" w:cs="Calibri" w:eastAsia="Calibri" w:hAnsi="Calibri"/>
+          <w:color w:val="1A1A1A"/>
+          <w:sz w:val="20"/>
+          <w:szCs w:val="20"/>
+        </w:rPr>
+        <w:t xml:space="preserve">.</w:t>
       </w:r>
     </w:p>
     <w:p>
@@ -227,18 +267,18 @@
           <w:sz w:val="20"/>
           <w:szCs w:val="20"/>
         </w:rPr>
-        <w:t xml:space="preserve">, 486 registered users and a 5.0-star App Store rating — owned solo from </w:t>
-      </w:r>
-      <w:r>
-        <w:rPr>
-          <w:rFonts w:ascii="Calibri" w:cs="Calibri" w:eastAsia="Calibri" w:hAnsi="Calibri"/>
-          <w:b/>
-          <w:bCs/>
-          <w:color w:val="1A1A1A"/>
-          <w:sz w:val="20"/>
-          <w:szCs w:val="20"/>
-        </w:rPr>
-        <w:t xml:space="preserve">market research and product characterization (PRD)</w:t>
+        <w:t xml:space="preserve">, 486 registered users and a 5.0-star App Store rating — designed and owned solo from </w:t>
+      </w:r>
+      <w:r>
+        <w:rPr>
+          <w:rFonts w:ascii="Calibri" w:cs="Calibri" w:eastAsia="Calibri" w:hAnsi="Calibri"/>
+          <w:b/>
+          <w:bCs/>
+          <w:color w:val="1A1A1A"/>
+          <w:sz w:val="20"/>
+          <w:szCs w:val="20"/>
+        </w:rPr>
+        <w:t xml:space="preserve">market research</w:t>
       </w:r>
       <w:r>
         <w:rPr>
@@ -303,6 +343,56 @@
           <w:sz w:val="20"/>
           <w:szCs w:val="20"/>
         </w:rPr>
+        <w:t xml:space="preserve">UX / Product Design: </w:t>
+      </w:r>
+      <w:r>
+        <w:rPr>
+          <w:rFonts w:ascii="Calibri" w:cs="Calibri" w:eastAsia="Calibri" w:hAnsi="Calibri"/>
+          <w:color w:val="1A1A1A"/>
+          <w:sz w:val="20"/>
+          <w:szCs w:val="20"/>
+        </w:rPr>
+        <w:t xml:space="preserve">User Flows · Information Architecture · Wireframing · Prototyping · High-Fidelity UI · Design Systems · Usability Testing · Accessibility · Mobile (iOS) &amp; Web</w:t>
+      </w:r>
+    </w:p>
+    <w:p>
+      <w:pPr>
+        <w:spacing w:after="60"/>
+      </w:pPr>
+      <w:r>
+        <w:rPr>
+          <w:rFonts w:ascii="Calibri" w:cs="Calibri" w:eastAsia="Calibri" w:hAnsi="Calibri"/>
+          <w:b/>
+          <w:bCs/>
+          <w:color w:val="1A1A1A"/>
+          <w:sz w:val="20"/>
+          <w:szCs w:val="20"/>
+        </w:rPr>
+        <w:t xml:space="preserve">Research &amp; Strategy: </w:t>
+      </w:r>
+      <w:r>
+        <w:rPr>
+          <w:rFonts w:ascii="Calibri" w:cs="Calibri" w:eastAsia="Calibri" w:hAnsi="Calibri"/>
+          <w:color w:val="1A1A1A"/>
+          <w:sz w:val="20"/>
+          <w:szCs w:val="20"/>
+        </w:rPr>
+        <w:t xml:space="preserve">Market Research · Competitive Analysis · Pricing Strategy · User Research &amp; Interviews · Personas &amp; User Journeys · Business Requirements Analysis · Go-to-Market Strategy</w:t>
+      </w:r>
+    </w:p>
+    <w:p>
+      <w:pPr>
+        <w:spacing w:after="60"/>
+      </w:pPr>
+      <w:r>
+        <w:rPr>
+          <w:rFonts w:ascii="Calibri" w:cs="Calibri" w:eastAsia="Calibri" w:hAnsi="Calibri"/>
+          <w:b/>
+          <w:bCs/>
+          <w:color w:val="1A1A1A"/>
+          <w:sz w:val="20"/>
+          <w:szCs w:val="20"/>
+        </w:rPr>
         <w:t xml:space="preserve">Product Management: </w:t>
       </w:r>
       <w:r>
@@ -338,56 +428,6 @@
           <w:szCs w:val="20"/>
         </w:rPr>
         <w:t xml:space="preserve">End-to-End Delivery · Cross-Functional Leadership · Stakeholder Management · Scope &amp; Timeline Management · Budget Management · Vendor Management · Risk &amp; Dependency Tracking · Agile Ways of Working</w:t>
-      </w:r>
-    </w:p>
-    <w:p>
-      <w:pPr>
-        <w:spacing w:after="60"/>
-      </w:pPr>
-      <w:r>
-        <w:rPr>
-          <w:rFonts w:ascii="Calibri" w:cs="Calibri" w:eastAsia="Calibri" w:hAnsi="Calibri"/>
-          <w:b/>
-          <w:bCs/>
-          <w:color w:val="1A1A1A"/>
-          <w:sz w:val="20"/>
-          <w:szCs w:val="20"/>
-        </w:rPr>
-        <w:t xml:space="preserve">Research &amp; Strategy: </w:t>
-      </w:r>
-      <w:r>
-        <w:rPr>
-          <w:rFonts w:ascii="Calibri" w:cs="Calibri" w:eastAsia="Calibri" w:hAnsi="Calibri"/>
-          <w:color w:val="1A1A1A"/>
-          <w:sz w:val="20"/>
-          <w:szCs w:val="20"/>
-        </w:rPr>
-        <w:t xml:space="preserve">Market Research · Competitive Analysis · Pricing Strategy · User Research &amp; Interviews · Personas &amp; User Journeys · Business Requirements Analysis · Go-to-Market Strategy</w:t>
-      </w:r>
-    </w:p>
-    <w:p>
-      <w:pPr>
-        <w:spacing w:after="60"/>
-      </w:pPr>
-      <w:r>
-        <w:rPr>
-          <w:rFonts w:ascii="Calibri" w:cs="Calibri" w:eastAsia="Calibri" w:hAnsi="Calibri"/>
-          <w:b/>
-          <w:bCs/>
-          <w:color w:val="1A1A1A"/>
-          <w:sz w:val="20"/>
-          <w:szCs w:val="20"/>
-        </w:rPr>
-        <w:t xml:space="preserve">UX / Product Design: </w:t>
-      </w:r>
-      <w:r>
-        <w:rPr>
-          <w:rFonts w:ascii="Calibri" w:cs="Calibri" w:eastAsia="Calibri" w:hAnsi="Calibri"/>
-          <w:color w:val="1A1A1A"/>
-          <w:sz w:val="20"/>
-          <w:szCs w:val="20"/>
-        </w:rPr>
-        <w:t xml:space="preserve">User Flows · Information Architecture · Wireframing · Prototyping · High-Fidelity UI · Design Systems · Usability Testing · Accessibility · Mobile (iOS) &amp; Web</w:t>
       </w:r>
     </w:p>
     <w:p>
@@ -423,7 +463,7 @@
           <w:sz w:val="22"/>
           <w:szCs w:val="22"/>
         </w:rPr>
-        <w:t xml:space="preserve">Founder &amp; Product Manager — Independent Digital Products</w:t>
+        <w:t xml:space="preserve">Founder &amp; Product Designer — Independent Digital Products</w:t>
       </w:r>
     </w:p>
     <w:p>
@@ -1373,7 +1413,7 @@
         </w:rPr>
         <w:t xml:space="preserve">Full case studies, process and screens: </w:t>
       </w:r>
-      <w:hyperlink w:history="1" r:id="rId6xcyfgiqwg_kzmfjzcyhx">
+      <w:hyperlink w:history="1" r:id="rIdoinvzdjnicmhtutsu8j_z">
         <w:r>
           <w:rPr>
             <w:rFonts w:ascii="Calibri" w:cs="Calibri" w:eastAsia="Calibri" w:hAnsi="Calibri"/>

</xml_diff>